<commit_message>
Implement Order Management System with State, Strategy, and Decorator patterns
</commit_message>
<xml_diff>
--- a/Tuan2/MinhChungDesignPattern.docx
+++ b/Tuan2/MinhChungDesignPattern.docx
@@ -69,6 +69,7 @@
       <w:r>
         <w:rPr>
           <w:rFonts w:ascii="Times New Roman" w:hAnsi="Times New Roman" w:cs="Times New Roman"/>
+          <w:noProof/>
           <w:sz w:val="26"/>
           <w:szCs w:val="26"/>
         </w:rPr>
@@ -120,6 +121,7 @@
       <w:r>
         <w:rPr>
           <w:rFonts w:ascii="Times New Roman" w:hAnsi="Times New Roman" w:cs="Times New Roman"/>
+          <w:noProof/>
           <w:sz w:val="26"/>
           <w:szCs w:val="26"/>
         </w:rPr>
@@ -188,6 +190,7 @@
       <w:r>
         <w:rPr>
           <w:rFonts w:ascii="Times New Roman" w:hAnsi="Times New Roman" w:cs="Times New Roman"/>
+          <w:noProof/>
           <w:sz w:val="26"/>
           <w:szCs w:val="26"/>
         </w:rPr>
@@ -240,6 +243,7 @@
       <w:r>
         <w:rPr>
           <w:rFonts w:ascii="Times New Roman" w:hAnsi="Times New Roman" w:cs="Times New Roman"/>
+          <w:noProof/>
           <w:sz w:val="26"/>
           <w:szCs w:val="26"/>
         </w:rPr>
@@ -316,6 +320,7 @@
       <w:r>
         <w:rPr>
           <w:rFonts w:ascii="Times New Roman" w:hAnsi="Times New Roman" w:cs="Times New Roman"/>
+          <w:noProof/>
           <w:sz w:val="26"/>
           <w:szCs w:val="26"/>
         </w:rPr>
@@ -368,6 +373,7 @@
       <w:r>
         <w:rPr>
           <w:rFonts w:ascii="Times New Roman" w:hAnsi="Times New Roman" w:cs="Times New Roman"/>
+          <w:noProof/>
           <w:sz w:val="26"/>
           <w:szCs w:val="26"/>
         </w:rPr>
@@ -491,6 +497,7 @@
       <w:r>
         <w:rPr>
           <w:rFonts w:ascii="Times New Roman" w:hAnsi="Times New Roman" w:cs="Times New Roman"/>
+          <w:noProof/>
           <w:sz w:val="26"/>
           <w:szCs w:val="26"/>
         </w:rPr>
@@ -566,6 +573,849 @@
           <w:szCs w:val="26"/>
         </w:rPr>
         <w:t>Bài 2:</w:t>
+      </w:r>
+    </w:p>
+    <w:p>
+      <w:pPr>
+        <w:rPr>
+          <w:rFonts w:ascii="Times New Roman" w:hAnsi="Times New Roman" w:cs="Times New Roman"/>
+          <w:b/>
+          <w:sz w:val="26"/>
+          <w:szCs w:val="26"/>
+        </w:rPr>
+      </w:pPr>
+      <w:r>
+        <w:rPr>
+          <w:rFonts w:ascii="Times New Roman" w:hAnsi="Times New Roman" w:cs="Times New Roman"/>
+          <w:b/>
+          <w:sz w:val="26"/>
+          <w:szCs w:val="26"/>
+        </w:rPr>
+        <w:t>STATE PATTERN</w:t>
+      </w:r>
+      <w:r>
+        <w:rPr>
+          <w:rFonts w:ascii="Times New Roman" w:hAnsi="Times New Roman" w:cs="Times New Roman"/>
+          <w:b/>
+          <w:sz w:val="26"/>
+          <w:szCs w:val="26"/>
+        </w:rPr>
+        <w:t>:</w:t>
+      </w:r>
+    </w:p>
+    <w:p>
+      <w:pPr>
+        <w:rPr>
+          <w:rFonts w:ascii="Times New Roman" w:hAnsi="Times New Roman" w:cs="Times New Roman"/>
+          <w:b/>
+          <w:sz w:val="26"/>
+          <w:szCs w:val="26"/>
+        </w:rPr>
+      </w:pPr>
+      <w:r>
+        <w:rPr>
+          <w:rFonts w:ascii="Times New Roman" w:hAnsi="Times New Roman" w:cs="Times New Roman"/>
+          <w:b/>
+          <w:sz w:val="26"/>
+          <w:szCs w:val="26"/>
+        </w:rPr>
+        <w:drawing>
+          <wp:inline distT="0" distB="0" distL="0" distR="0" wp14:anchorId="3FF7A126" wp14:editId="5E15F95C">
+            <wp:extent cx="2534004" cy="1352739"/>
+            <wp:effectExtent l="0" t="0" r="0" b="0"/>
+            <wp:docPr id="8" name="Picture 8"/>
+            <wp:cNvGraphicFramePr>
+              <a:graphicFrameLocks xmlns:a="http://schemas.openxmlformats.org/drawingml/2006/main" noChangeAspect="1"/>
+            </wp:cNvGraphicFramePr>
+            <a:graphic xmlns:a="http://schemas.openxmlformats.org/drawingml/2006/main">
+              <a:graphicData uri="http://schemas.openxmlformats.org/drawingml/2006/picture">
+                <pic:pic xmlns:pic="http://schemas.openxmlformats.org/drawingml/2006/picture">
+                  <pic:nvPicPr>
+                    <pic:cNvPr id="1" name=""/>
+                    <pic:cNvPicPr/>
+                  </pic:nvPicPr>
+                  <pic:blipFill>
+                    <a:blip r:embed="rId11"/>
+                    <a:stretch>
+                      <a:fillRect/>
+                    </a:stretch>
+                  </pic:blipFill>
+                  <pic:spPr>
+                    <a:xfrm>
+                      <a:off x="0" y="0"/>
+                      <a:ext cx="2534004" cy="1352739"/>
+                    </a:xfrm>
+                    <a:prstGeom prst="rect">
+                      <a:avLst/>
+                    </a:prstGeom>
+                  </pic:spPr>
+                </pic:pic>
+              </a:graphicData>
+            </a:graphic>
+          </wp:inline>
+        </w:drawing>
+      </w:r>
+    </w:p>
+    <w:p>
+      <w:pPr>
+        <w:rPr>
+          <w:rFonts w:ascii="Times New Roman" w:hAnsi="Times New Roman" w:cs="Times New Roman"/>
+          <w:b/>
+          <w:sz w:val="26"/>
+          <w:szCs w:val="26"/>
+        </w:rPr>
+      </w:pPr>
+      <w:r>
+        <w:rPr>
+          <w:rFonts w:ascii="Times New Roman" w:hAnsi="Times New Roman" w:cs="Times New Roman"/>
+          <w:b/>
+          <w:sz w:val="26"/>
+          <w:szCs w:val="26"/>
+        </w:rPr>
+        <w:lastRenderedPageBreak/>
+        <w:drawing>
+          <wp:inline distT="0" distB="0" distL="0" distR="0" wp14:anchorId="5B502FC4" wp14:editId="340FED55">
+            <wp:extent cx="4686954" cy="6573167"/>
+            <wp:effectExtent l="0" t="0" r="0" b="0"/>
+            <wp:docPr id="9" name="Picture 9"/>
+            <wp:cNvGraphicFramePr>
+              <a:graphicFrameLocks xmlns:a="http://schemas.openxmlformats.org/drawingml/2006/main" noChangeAspect="1"/>
+            </wp:cNvGraphicFramePr>
+            <a:graphic xmlns:a="http://schemas.openxmlformats.org/drawingml/2006/main">
+              <a:graphicData uri="http://schemas.openxmlformats.org/drawingml/2006/picture">
+                <pic:pic xmlns:pic="http://schemas.openxmlformats.org/drawingml/2006/picture">
+                  <pic:nvPicPr>
+                    <pic:cNvPr id="1" name=""/>
+                    <pic:cNvPicPr/>
+                  </pic:nvPicPr>
+                  <pic:blipFill>
+                    <a:blip r:embed="rId12"/>
+                    <a:stretch>
+                      <a:fillRect/>
+                    </a:stretch>
+                  </pic:blipFill>
+                  <pic:spPr>
+                    <a:xfrm>
+                      <a:off x="0" y="0"/>
+                      <a:ext cx="4686954" cy="6573167"/>
+                    </a:xfrm>
+                    <a:prstGeom prst="rect">
+                      <a:avLst/>
+                    </a:prstGeom>
+                  </pic:spPr>
+                </pic:pic>
+              </a:graphicData>
+            </a:graphic>
+          </wp:inline>
+        </w:drawing>
+      </w:r>
+    </w:p>
+    <w:p>
+      <w:pPr>
+        <w:rPr>
+          <w:rFonts w:ascii="Times New Roman" w:hAnsi="Times New Roman" w:cs="Times New Roman"/>
+          <w:b/>
+          <w:sz w:val="26"/>
+          <w:szCs w:val="26"/>
+        </w:rPr>
+      </w:pPr>
+    </w:p>
+    <w:p>
+      <w:pPr>
+        <w:rPr>
+          <w:rFonts w:ascii="Times New Roman" w:hAnsi="Times New Roman" w:cs="Times New Roman"/>
+          <w:b/>
+          <w:sz w:val="26"/>
+          <w:szCs w:val="26"/>
+        </w:rPr>
+      </w:pPr>
+      <w:r>
+        <w:rPr>
+          <w:rFonts w:ascii="Times New Roman" w:hAnsi="Times New Roman" w:cs="Times New Roman"/>
+          <w:b/>
+          <w:sz w:val="26"/>
+          <w:szCs w:val="26"/>
+        </w:rPr>
+        <w:lastRenderedPageBreak/>
+        <w:drawing>
+          <wp:inline distT="0" distB="0" distL="0" distR="0" wp14:anchorId="2E96E8B1" wp14:editId="29329622">
+            <wp:extent cx="5943600" cy="2691765"/>
+            <wp:effectExtent l="0" t="0" r="0" b="0"/>
+            <wp:docPr id="10" name="Picture 10"/>
+            <wp:cNvGraphicFramePr>
+              <a:graphicFrameLocks xmlns:a="http://schemas.openxmlformats.org/drawingml/2006/main" noChangeAspect="1"/>
+            </wp:cNvGraphicFramePr>
+            <a:graphic xmlns:a="http://schemas.openxmlformats.org/drawingml/2006/main">
+              <a:graphicData uri="http://schemas.openxmlformats.org/drawingml/2006/picture">
+                <pic:pic xmlns:pic="http://schemas.openxmlformats.org/drawingml/2006/picture">
+                  <pic:nvPicPr>
+                    <pic:cNvPr id="1" name=""/>
+                    <pic:cNvPicPr/>
+                  </pic:nvPicPr>
+                  <pic:blipFill>
+                    <a:blip r:embed="rId13"/>
+                    <a:stretch>
+                      <a:fillRect/>
+                    </a:stretch>
+                  </pic:blipFill>
+                  <pic:spPr>
+                    <a:xfrm>
+                      <a:off x="0" y="0"/>
+                      <a:ext cx="5943600" cy="2691765"/>
+                    </a:xfrm>
+                    <a:prstGeom prst="rect">
+                      <a:avLst/>
+                    </a:prstGeom>
+                  </pic:spPr>
+                </pic:pic>
+              </a:graphicData>
+            </a:graphic>
+          </wp:inline>
+        </w:drawing>
+      </w:r>
+    </w:p>
+    <w:p>
+      <w:pPr>
+        <w:rPr>
+          <w:rFonts w:ascii="Times New Roman" w:hAnsi="Times New Roman" w:cs="Times New Roman"/>
+          <w:b/>
+          <w:sz w:val="26"/>
+          <w:szCs w:val="26"/>
+        </w:rPr>
+      </w:pPr>
+      <w:r>
+        <w:rPr>
+          <w:rFonts w:ascii="Times New Roman" w:hAnsi="Times New Roman" w:cs="Times New Roman"/>
+          <w:b/>
+          <w:sz w:val="26"/>
+          <w:szCs w:val="26"/>
+        </w:rPr>
+        <w:t>STRATEGY PATTERN</w:t>
+      </w:r>
+      <w:r>
+        <w:rPr>
+          <w:rFonts w:ascii="Times New Roman" w:hAnsi="Times New Roman" w:cs="Times New Roman"/>
+          <w:b/>
+          <w:sz w:val="26"/>
+          <w:szCs w:val="26"/>
+        </w:rPr>
+        <w:t>:</w:t>
+      </w:r>
+    </w:p>
+    <w:p>
+      <w:pPr>
+        <w:rPr>
+          <w:rFonts w:ascii="Times New Roman" w:hAnsi="Times New Roman" w:cs="Times New Roman"/>
+          <w:b/>
+          <w:sz w:val="26"/>
+          <w:szCs w:val="26"/>
+        </w:rPr>
+      </w:pPr>
+      <w:r>
+        <w:rPr>
+          <w:rFonts w:ascii="Times New Roman" w:hAnsi="Times New Roman" w:cs="Times New Roman"/>
+          <w:b/>
+          <w:sz w:val="26"/>
+          <w:szCs w:val="26"/>
+        </w:rPr>
+        <w:drawing>
+          <wp:inline distT="0" distB="0" distL="0" distR="0" wp14:anchorId="1C9D2D57" wp14:editId="1FD08863">
+            <wp:extent cx="3524742" cy="924054"/>
+            <wp:effectExtent l="0" t="0" r="0" b="9525"/>
+            <wp:docPr id="11" name="Picture 11"/>
+            <wp:cNvGraphicFramePr>
+              <a:graphicFrameLocks xmlns:a="http://schemas.openxmlformats.org/drawingml/2006/main" noChangeAspect="1"/>
+            </wp:cNvGraphicFramePr>
+            <a:graphic xmlns:a="http://schemas.openxmlformats.org/drawingml/2006/main">
+              <a:graphicData uri="http://schemas.openxmlformats.org/drawingml/2006/picture">
+                <pic:pic xmlns:pic="http://schemas.openxmlformats.org/drawingml/2006/picture">
+                  <pic:nvPicPr>
+                    <pic:cNvPr id="1" name=""/>
+                    <pic:cNvPicPr/>
+                  </pic:nvPicPr>
+                  <pic:blipFill>
+                    <a:blip r:embed="rId14"/>
+                    <a:stretch>
+                      <a:fillRect/>
+                    </a:stretch>
+                  </pic:blipFill>
+                  <pic:spPr>
+                    <a:xfrm>
+                      <a:off x="0" y="0"/>
+                      <a:ext cx="3524742" cy="924054"/>
+                    </a:xfrm>
+                    <a:prstGeom prst="rect">
+                      <a:avLst/>
+                    </a:prstGeom>
+                  </pic:spPr>
+                </pic:pic>
+              </a:graphicData>
+            </a:graphic>
+          </wp:inline>
+        </w:drawing>
+      </w:r>
+    </w:p>
+    <w:p>
+      <w:pPr>
+        <w:rPr>
+          <w:rFonts w:ascii="Times New Roman" w:hAnsi="Times New Roman" w:cs="Times New Roman"/>
+          <w:b/>
+          <w:sz w:val="26"/>
+          <w:szCs w:val="26"/>
+        </w:rPr>
+      </w:pPr>
+      <w:r>
+        <w:rPr>
+          <w:rFonts w:ascii="Times New Roman" w:hAnsi="Times New Roman" w:cs="Times New Roman"/>
+          <w:b/>
+          <w:sz w:val="26"/>
+          <w:szCs w:val="26"/>
+        </w:rPr>
+        <w:lastRenderedPageBreak/>
+        <w:drawing>
+          <wp:inline distT="0" distB="0" distL="0" distR="0" wp14:anchorId="01C216C3" wp14:editId="45A15242">
+            <wp:extent cx="4972744" cy="1924319"/>
+            <wp:effectExtent l="0" t="0" r="0" b="0"/>
+            <wp:docPr id="12" name="Picture 12"/>
+            <wp:cNvGraphicFramePr>
+              <a:graphicFrameLocks xmlns:a="http://schemas.openxmlformats.org/drawingml/2006/main" noChangeAspect="1"/>
+            </wp:cNvGraphicFramePr>
+            <a:graphic xmlns:a="http://schemas.openxmlformats.org/drawingml/2006/main">
+              <a:graphicData uri="http://schemas.openxmlformats.org/drawingml/2006/picture">
+                <pic:pic xmlns:pic="http://schemas.openxmlformats.org/drawingml/2006/picture">
+                  <pic:nvPicPr>
+                    <pic:cNvPr id="1" name=""/>
+                    <pic:cNvPicPr/>
+                  </pic:nvPicPr>
+                  <pic:blipFill>
+                    <a:blip r:embed="rId15"/>
+                    <a:stretch>
+                      <a:fillRect/>
+                    </a:stretch>
+                  </pic:blipFill>
+                  <pic:spPr>
+                    <a:xfrm>
+                      <a:off x="0" y="0"/>
+                      <a:ext cx="4972744" cy="1924319"/>
+                    </a:xfrm>
+                    <a:prstGeom prst="rect">
+                      <a:avLst/>
+                    </a:prstGeom>
+                  </pic:spPr>
+                </pic:pic>
+              </a:graphicData>
+            </a:graphic>
+          </wp:inline>
+        </w:drawing>
+      </w:r>
+      <w:r>
+        <w:rPr>
+          <w:rFonts w:ascii="Times New Roman" w:hAnsi="Times New Roman" w:cs="Times New Roman"/>
+          <w:b/>
+          <w:sz w:val="26"/>
+          <w:szCs w:val="26"/>
+        </w:rPr>
+        <w:drawing>
+          <wp:inline distT="0" distB="0" distL="0" distR="0" wp14:anchorId="593AA9E3" wp14:editId="0278673E">
+            <wp:extent cx="5943600" cy="2534285"/>
+            <wp:effectExtent l="0" t="0" r="0" b="0"/>
+            <wp:docPr id="13" name="Picture 13"/>
+            <wp:cNvGraphicFramePr>
+              <a:graphicFrameLocks xmlns:a="http://schemas.openxmlformats.org/drawingml/2006/main" noChangeAspect="1"/>
+            </wp:cNvGraphicFramePr>
+            <a:graphic xmlns:a="http://schemas.openxmlformats.org/drawingml/2006/main">
+              <a:graphicData uri="http://schemas.openxmlformats.org/drawingml/2006/picture">
+                <pic:pic xmlns:pic="http://schemas.openxmlformats.org/drawingml/2006/picture">
+                  <pic:nvPicPr>
+                    <pic:cNvPr id="1" name=""/>
+                    <pic:cNvPicPr/>
+                  </pic:nvPicPr>
+                  <pic:blipFill>
+                    <a:blip r:embed="rId16"/>
+                    <a:stretch>
+                      <a:fillRect/>
+                    </a:stretch>
+                  </pic:blipFill>
+                  <pic:spPr>
+                    <a:xfrm>
+                      <a:off x="0" y="0"/>
+                      <a:ext cx="5943600" cy="2534285"/>
+                    </a:xfrm>
+                    <a:prstGeom prst="rect">
+                      <a:avLst/>
+                    </a:prstGeom>
+                  </pic:spPr>
+                </pic:pic>
+              </a:graphicData>
+            </a:graphic>
+          </wp:inline>
+        </w:drawing>
+      </w:r>
+    </w:p>
+    <w:p>
+      <w:pPr>
+        <w:rPr>
+          <w:rFonts w:ascii="Times New Roman" w:hAnsi="Times New Roman" w:cs="Times New Roman"/>
+          <w:b/>
+          <w:sz w:val="26"/>
+          <w:szCs w:val="26"/>
+        </w:rPr>
+      </w:pPr>
+      <w:r>
+        <w:rPr>
+          <w:rFonts w:ascii="Times New Roman" w:hAnsi="Times New Roman" w:cs="Times New Roman"/>
+          <w:b/>
+          <w:sz w:val="26"/>
+          <w:szCs w:val="26"/>
+        </w:rPr>
+        <w:drawing>
+          <wp:inline distT="0" distB="0" distL="0" distR="0" wp14:anchorId="2200EE52" wp14:editId="501A5575">
+            <wp:extent cx="5943600" cy="1689100"/>
+            <wp:effectExtent l="0" t="0" r="0" b="6350"/>
+            <wp:docPr id="14" name="Picture 14"/>
+            <wp:cNvGraphicFramePr>
+              <a:graphicFrameLocks xmlns:a="http://schemas.openxmlformats.org/drawingml/2006/main" noChangeAspect="1"/>
+            </wp:cNvGraphicFramePr>
+            <a:graphic xmlns:a="http://schemas.openxmlformats.org/drawingml/2006/main">
+              <a:graphicData uri="http://schemas.openxmlformats.org/drawingml/2006/picture">
+                <pic:pic xmlns:pic="http://schemas.openxmlformats.org/drawingml/2006/picture">
+                  <pic:nvPicPr>
+                    <pic:cNvPr id="1" name=""/>
+                    <pic:cNvPicPr/>
+                  </pic:nvPicPr>
+                  <pic:blipFill>
+                    <a:blip r:embed="rId17"/>
+                    <a:stretch>
+                      <a:fillRect/>
+                    </a:stretch>
+                  </pic:blipFill>
+                  <pic:spPr>
+                    <a:xfrm>
+                      <a:off x="0" y="0"/>
+                      <a:ext cx="5943600" cy="1689100"/>
+                    </a:xfrm>
+                    <a:prstGeom prst="rect">
+                      <a:avLst/>
+                    </a:prstGeom>
+                  </pic:spPr>
+                </pic:pic>
+              </a:graphicData>
+            </a:graphic>
+          </wp:inline>
+        </w:drawing>
+      </w:r>
+    </w:p>
+    <w:p>
+      <w:pPr>
+        <w:rPr>
+          <w:rFonts w:ascii="Times New Roman" w:hAnsi="Times New Roman" w:cs="Times New Roman"/>
+          <w:b/>
+          <w:sz w:val="26"/>
+          <w:szCs w:val="26"/>
+        </w:rPr>
+      </w:pPr>
+      <w:r>
+        <w:rPr>
+          <w:rFonts w:ascii="Times New Roman" w:hAnsi="Times New Roman" w:cs="Times New Roman"/>
+          <w:b/>
+          <w:sz w:val="26"/>
+          <w:szCs w:val="26"/>
+        </w:rPr>
+        <w:t>DECORATOR PATTERN</w:t>
+      </w:r>
+      <w:r>
+        <w:rPr>
+          <w:rFonts w:ascii="Times New Roman" w:hAnsi="Times New Roman" w:cs="Times New Roman"/>
+          <w:b/>
+          <w:sz w:val="26"/>
+          <w:szCs w:val="26"/>
+        </w:rPr>
+        <w:t>:</w:t>
+      </w:r>
+    </w:p>
+    <w:p>
+      <w:pPr>
+        <w:rPr>
+          <w:rFonts w:ascii="Times New Roman" w:hAnsi="Times New Roman" w:cs="Times New Roman"/>
+          <w:b/>
+          <w:sz w:val="26"/>
+          <w:szCs w:val="26"/>
+        </w:rPr>
+      </w:pPr>
+      <w:r>
+        <w:rPr>
+          <w:rFonts w:ascii="Times New Roman" w:hAnsi="Times New Roman" w:cs="Times New Roman"/>
+          <w:b/>
+          <w:sz w:val="26"/>
+          <w:szCs w:val="26"/>
+        </w:rPr>
+        <w:lastRenderedPageBreak/>
+        <w:drawing>
+          <wp:inline distT="0" distB="0" distL="0" distR="0" wp14:anchorId="29C33247" wp14:editId="21F4F435">
+            <wp:extent cx="4629796" cy="1714739"/>
+            <wp:effectExtent l="0" t="0" r="0" b="0"/>
+            <wp:docPr id="15" name="Picture 15"/>
+            <wp:cNvGraphicFramePr>
+              <a:graphicFrameLocks xmlns:a="http://schemas.openxmlformats.org/drawingml/2006/main" noChangeAspect="1"/>
+            </wp:cNvGraphicFramePr>
+            <a:graphic xmlns:a="http://schemas.openxmlformats.org/drawingml/2006/main">
+              <a:graphicData uri="http://schemas.openxmlformats.org/drawingml/2006/picture">
+                <pic:pic xmlns:pic="http://schemas.openxmlformats.org/drawingml/2006/picture">
+                  <pic:nvPicPr>
+                    <pic:cNvPr id="1" name=""/>
+                    <pic:cNvPicPr/>
+                  </pic:nvPicPr>
+                  <pic:blipFill>
+                    <a:blip r:embed="rId18"/>
+                    <a:stretch>
+                      <a:fillRect/>
+                    </a:stretch>
+                  </pic:blipFill>
+                  <pic:spPr>
+                    <a:xfrm>
+                      <a:off x="0" y="0"/>
+                      <a:ext cx="4629796" cy="1714739"/>
+                    </a:xfrm>
+                    <a:prstGeom prst="rect">
+                      <a:avLst/>
+                    </a:prstGeom>
+                  </pic:spPr>
+                </pic:pic>
+              </a:graphicData>
+            </a:graphic>
+          </wp:inline>
+        </w:drawing>
+      </w:r>
+      <w:r>
+        <w:rPr>
+          <w:rFonts w:ascii="Times New Roman" w:hAnsi="Times New Roman" w:cs="Times New Roman"/>
+          <w:b/>
+          <w:sz w:val="26"/>
+          <w:szCs w:val="26"/>
+        </w:rPr>
+        <w:drawing>
+          <wp:inline distT="0" distB="0" distL="0" distR="0" wp14:anchorId="63A2670C" wp14:editId="14685574">
+            <wp:extent cx="5943600" cy="4982210"/>
+            <wp:effectExtent l="0" t="0" r="0" b="8890"/>
+            <wp:docPr id="16" name="Picture 16"/>
+            <wp:cNvGraphicFramePr>
+              <a:graphicFrameLocks xmlns:a="http://schemas.openxmlformats.org/drawingml/2006/main" noChangeAspect="1"/>
+            </wp:cNvGraphicFramePr>
+            <a:graphic xmlns:a="http://schemas.openxmlformats.org/drawingml/2006/main">
+              <a:graphicData uri="http://schemas.openxmlformats.org/drawingml/2006/picture">
+                <pic:pic xmlns:pic="http://schemas.openxmlformats.org/drawingml/2006/picture">
+                  <pic:nvPicPr>
+                    <pic:cNvPr id="1" name=""/>
+                    <pic:cNvPicPr/>
+                  </pic:nvPicPr>
+                  <pic:blipFill>
+                    <a:blip r:embed="rId19"/>
+                    <a:stretch>
+                      <a:fillRect/>
+                    </a:stretch>
+                  </pic:blipFill>
+                  <pic:spPr>
+                    <a:xfrm>
+                      <a:off x="0" y="0"/>
+                      <a:ext cx="5943600" cy="4982210"/>
+                    </a:xfrm>
+                    <a:prstGeom prst="rect">
+                      <a:avLst/>
+                    </a:prstGeom>
+                  </pic:spPr>
+                </pic:pic>
+              </a:graphicData>
+            </a:graphic>
+          </wp:inline>
+        </w:drawing>
+      </w:r>
+      <w:r>
+        <w:rPr>
+          <w:rFonts w:ascii="Times New Roman" w:hAnsi="Times New Roman" w:cs="Times New Roman"/>
+          <w:b/>
+          <w:sz w:val="26"/>
+          <w:szCs w:val="26"/>
+        </w:rPr>
+        <w:lastRenderedPageBreak/>
+        <w:drawing>
+          <wp:inline distT="0" distB="0" distL="0" distR="0" wp14:anchorId="2DB55D39" wp14:editId="45CC1F36">
+            <wp:extent cx="5753903" cy="2400635"/>
+            <wp:effectExtent l="0" t="0" r="0" b="0"/>
+            <wp:docPr id="17" name="Picture 17"/>
+            <wp:cNvGraphicFramePr>
+              <a:graphicFrameLocks xmlns:a="http://schemas.openxmlformats.org/drawingml/2006/main" noChangeAspect="1"/>
+            </wp:cNvGraphicFramePr>
+            <a:graphic xmlns:a="http://schemas.openxmlformats.org/drawingml/2006/main">
+              <a:graphicData uri="http://schemas.openxmlformats.org/drawingml/2006/picture">
+                <pic:pic xmlns:pic="http://schemas.openxmlformats.org/drawingml/2006/picture">
+                  <pic:nvPicPr>
+                    <pic:cNvPr id="1" name=""/>
+                    <pic:cNvPicPr/>
+                  </pic:nvPicPr>
+                  <pic:blipFill>
+                    <a:blip r:embed="rId20"/>
+                    <a:stretch>
+                      <a:fillRect/>
+                    </a:stretch>
+                  </pic:blipFill>
+                  <pic:spPr>
+                    <a:xfrm>
+                      <a:off x="0" y="0"/>
+                      <a:ext cx="5753903" cy="2400635"/>
+                    </a:xfrm>
+                    <a:prstGeom prst="rect">
+                      <a:avLst/>
+                    </a:prstGeom>
+                  </pic:spPr>
+                </pic:pic>
+              </a:graphicData>
+            </a:graphic>
+          </wp:inline>
+        </w:drawing>
+      </w:r>
+    </w:p>
+    <w:p>
+      <w:pPr>
+        <w:rPr>
+          <w:rFonts w:ascii="Times New Roman" w:hAnsi="Times New Roman" w:cs="Times New Roman"/>
+          <w:b/>
+          <w:sz w:val="26"/>
+          <w:szCs w:val="26"/>
+        </w:rPr>
+      </w:pPr>
+    </w:p>
+    <w:p>
+      <w:pPr>
+        <w:rPr>
+          <w:rFonts w:ascii="Times New Roman" w:hAnsi="Times New Roman" w:cs="Times New Roman"/>
+          <w:b/>
+          <w:sz w:val="26"/>
+          <w:szCs w:val="26"/>
+        </w:rPr>
+      </w:pPr>
+    </w:p>
+    <w:p>
+      <w:pPr>
+        <w:rPr>
+          <w:rFonts w:ascii="Times New Roman" w:hAnsi="Times New Roman" w:cs="Times New Roman"/>
+          <w:b/>
+          <w:sz w:val="26"/>
+          <w:szCs w:val="26"/>
+        </w:rPr>
+      </w:pPr>
+      <w:r>
+        <w:rPr>
+          <w:rFonts w:ascii="Times New Roman" w:hAnsi="Times New Roman" w:cs="Times New Roman"/>
+          <w:b/>
+          <w:sz w:val="26"/>
+          <w:szCs w:val="26"/>
+        </w:rPr>
+        <w:t>KẾT QUẢ:</w:t>
+      </w:r>
+    </w:p>
+    <w:p>
+      <w:pPr>
+        <w:rPr>
+          <w:rFonts w:ascii="Times New Roman" w:hAnsi="Times New Roman" w:cs="Times New Roman"/>
+          <w:b/>
+          <w:sz w:val="26"/>
+          <w:szCs w:val="26"/>
+        </w:rPr>
+      </w:pPr>
+      <w:r>
+        <w:rPr>
+          <w:rFonts w:ascii="Times New Roman" w:hAnsi="Times New Roman" w:cs="Times New Roman"/>
+          <w:b/>
+          <w:sz w:val="26"/>
+          <w:szCs w:val="26"/>
+        </w:rPr>
+        <w:drawing>
+          <wp:inline distT="0" distB="0" distL="0" distR="0" wp14:anchorId="33F0DA30" wp14:editId="28037601">
+            <wp:extent cx="5582429" cy="4534533"/>
+            <wp:effectExtent l="0" t="0" r="0" b="0"/>
+            <wp:docPr id="18" name="Picture 18"/>
+            <wp:cNvGraphicFramePr>
+              <a:graphicFrameLocks xmlns:a="http://schemas.openxmlformats.org/drawingml/2006/main" noChangeAspect="1"/>
+            </wp:cNvGraphicFramePr>
+            <a:graphic xmlns:a="http://schemas.openxmlformats.org/drawingml/2006/main">
+              <a:graphicData uri="http://schemas.openxmlformats.org/drawingml/2006/picture">
+                <pic:pic xmlns:pic="http://schemas.openxmlformats.org/drawingml/2006/picture">
+                  <pic:nvPicPr>
+                    <pic:cNvPr id="1" name=""/>
+                    <pic:cNvPicPr/>
+                  </pic:nvPicPr>
+                  <pic:blipFill>
+                    <a:blip r:embed="rId21"/>
+                    <a:stretch>
+                      <a:fillRect/>
+                    </a:stretch>
+                  </pic:blipFill>
+                  <pic:spPr>
+                    <a:xfrm>
+                      <a:off x="0" y="0"/>
+                      <a:ext cx="5582429" cy="4534533"/>
+                    </a:xfrm>
+                    <a:prstGeom prst="rect">
+                      <a:avLst/>
+                    </a:prstGeom>
+                  </pic:spPr>
+                </pic:pic>
+              </a:graphicData>
+            </a:graphic>
+          </wp:inline>
+        </w:drawing>
+      </w:r>
+    </w:p>
+    <w:p>
+      <w:pPr>
+        <w:rPr>
+          <w:rFonts w:ascii="Times New Roman" w:hAnsi="Times New Roman" w:cs="Times New Roman"/>
+          <w:b/>
+          <w:sz w:val="26"/>
+          <w:szCs w:val="26"/>
+        </w:rPr>
+      </w:pPr>
+      <w:r>
+        <w:rPr>
+          <w:rFonts w:ascii="Times New Roman" w:hAnsi="Times New Roman" w:cs="Times New Roman"/>
+          <w:b/>
+          <w:sz w:val="26"/>
+          <w:szCs w:val="26"/>
+        </w:rPr>
+        <w:lastRenderedPageBreak/>
+        <w:drawing>
+          <wp:inline distT="0" distB="0" distL="0" distR="0" wp14:anchorId="13D42D3A" wp14:editId="6C5B09D1">
+            <wp:extent cx="4496427" cy="3829584"/>
+            <wp:effectExtent l="0" t="0" r="0" b="0"/>
+            <wp:docPr id="19" name="Picture 19"/>
+            <wp:cNvGraphicFramePr>
+              <a:graphicFrameLocks xmlns:a="http://schemas.openxmlformats.org/drawingml/2006/main" noChangeAspect="1"/>
+            </wp:cNvGraphicFramePr>
+            <a:graphic xmlns:a="http://schemas.openxmlformats.org/drawingml/2006/main">
+              <a:graphicData uri="http://schemas.openxmlformats.org/drawingml/2006/picture">
+                <pic:pic xmlns:pic="http://schemas.openxmlformats.org/drawingml/2006/picture">
+                  <pic:nvPicPr>
+                    <pic:cNvPr id="1" name=""/>
+                    <pic:cNvPicPr/>
+                  </pic:nvPicPr>
+                  <pic:blipFill>
+                    <a:blip r:embed="rId22"/>
+                    <a:stretch>
+                      <a:fillRect/>
+                    </a:stretch>
+                  </pic:blipFill>
+                  <pic:spPr>
+                    <a:xfrm>
+                      <a:off x="0" y="0"/>
+                      <a:ext cx="4496427" cy="3829584"/>
+                    </a:xfrm>
+                    <a:prstGeom prst="rect">
+                      <a:avLst/>
+                    </a:prstGeom>
+                  </pic:spPr>
+                </pic:pic>
+              </a:graphicData>
+            </a:graphic>
+          </wp:inline>
+        </w:drawing>
+      </w:r>
+    </w:p>
+    <w:p>
+      <w:pPr>
+        <w:rPr>
+          <w:rFonts w:ascii="Times New Roman" w:hAnsi="Times New Roman" w:cs="Times New Roman"/>
+          <w:b/>
+          <w:sz w:val="26"/>
+          <w:szCs w:val="26"/>
+        </w:rPr>
+      </w:pPr>
+      <w:r>
+        <w:rPr>
+          <w:rFonts w:ascii="Times New Roman" w:hAnsi="Times New Roman" w:cs="Times New Roman"/>
+          <w:b/>
+          <w:sz w:val="26"/>
+          <w:szCs w:val="26"/>
+        </w:rPr>
+        <w:lastRenderedPageBreak/>
+        <w:drawing>
+          <wp:inline distT="0" distB="0" distL="0" distR="0" wp14:anchorId="43BEDFC1" wp14:editId="3E019B6A">
+            <wp:extent cx="5896798" cy="5696745"/>
+            <wp:effectExtent l="0" t="0" r="8890" b="0"/>
+            <wp:docPr id="20" name="Picture 20"/>
+            <wp:cNvGraphicFramePr>
+              <a:graphicFrameLocks xmlns:a="http://schemas.openxmlformats.org/drawingml/2006/main" noChangeAspect="1"/>
+            </wp:cNvGraphicFramePr>
+            <a:graphic xmlns:a="http://schemas.openxmlformats.org/drawingml/2006/main">
+              <a:graphicData uri="http://schemas.openxmlformats.org/drawingml/2006/picture">
+                <pic:pic xmlns:pic="http://schemas.openxmlformats.org/drawingml/2006/picture">
+                  <pic:nvPicPr>
+                    <pic:cNvPr id="1" name=""/>
+                    <pic:cNvPicPr/>
+                  </pic:nvPicPr>
+                  <pic:blipFill>
+                    <a:blip r:embed="rId23"/>
+                    <a:stretch>
+                      <a:fillRect/>
+                    </a:stretch>
+                  </pic:blipFill>
+                  <pic:spPr>
+                    <a:xfrm>
+                      <a:off x="0" y="0"/>
+                      <a:ext cx="5896798" cy="5696745"/>
+                    </a:xfrm>
+                    <a:prstGeom prst="rect">
+                      <a:avLst/>
+                    </a:prstGeom>
+                  </pic:spPr>
+                </pic:pic>
+              </a:graphicData>
+            </a:graphic>
+          </wp:inline>
+        </w:drawing>
+      </w:r>
+      <w:r>
+        <w:rPr>
+          <w:rFonts w:ascii="Times New Roman" w:hAnsi="Times New Roman" w:cs="Times New Roman"/>
+          <w:b/>
+          <w:sz w:val="26"/>
+          <w:szCs w:val="26"/>
+        </w:rPr>
+        <w:lastRenderedPageBreak/>
+        <w:drawing>
+          <wp:inline distT="0" distB="0" distL="0" distR="0" wp14:anchorId="09F547A4" wp14:editId="003197FC">
+            <wp:extent cx="5229955" cy="3991532"/>
+            <wp:effectExtent l="0" t="0" r="8890" b="9525"/>
+            <wp:docPr id="21" name="Picture 21"/>
+            <wp:cNvGraphicFramePr>
+              <a:graphicFrameLocks xmlns:a="http://schemas.openxmlformats.org/drawingml/2006/main" noChangeAspect="1"/>
+            </wp:cNvGraphicFramePr>
+            <a:graphic xmlns:a="http://schemas.openxmlformats.org/drawingml/2006/main">
+              <a:graphicData uri="http://schemas.openxmlformats.org/drawingml/2006/picture">
+                <pic:pic xmlns:pic="http://schemas.openxmlformats.org/drawingml/2006/picture">
+                  <pic:nvPicPr>
+                    <pic:cNvPr id="1" name=""/>
+                    <pic:cNvPicPr/>
+                  </pic:nvPicPr>
+                  <pic:blipFill>
+                    <a:blip r:embed="rId24"/>
+                    <a:stretch>
+                      <a:fillRect/>
+                    </a:stretch>
+                  </pic:blipFill>
+                  <pic:spPr>
+                    <a:xfrm>
+                      <a:off x="0" y="0"/>
+                      <a:ext cx="5229955" cy="3991532"/>
+                    </a:xfrm>
+                    <a:prstGeom prst="rect">
+                      <a:avLst/>
+                    </a:prstGeom>
+                  </pic:spPr>
+                </pic:pic>
+              </a:graphicData>
+            </a:graphic>
+          </wp:inline>
+        </w:drawing>
       </w:r>
       <w:bookmarkStart w:id="0" w:name="_GoBack"/>
       <w:bookmarkEnd w:id="0"/>

</xml_diff>